<commit_message>
Add cohort documents (КП/СЗ/Договор save + signed-contract upload)
Cohort card now has org_name/inn fields, and КП/СЗ/Договор(ЮЛ/ФЛ)
generated for a group are also uploaded and listed on the cohort card
for later re-download, alongside a manual upload for the scanned
signed contract. КП template: removed the yellow placeholder styling
and two unused blank lines, added an ИНН marker under the org name.
Added marked-up Договор templates (ЮЛ/ФЛ) - only программа and
стоимость are auto-filled, per the user's explicit scope.

Co-Authored-By: Claude Sonnet 5 <noreply@anthropic.com>
</commit_message>
<xml_diff>
--- a/templates/kp_template.docx
+++ b/templates/kp_template.docx
@@ -91,7 +91,6 @@
                                 <w:rStyle w:val="color-marker"/>
                                 <w:b/>
                                 <w:bCs/>
-                                <w:highlight w:val="yellow"/>
                               </w:rPr>
                             </w:pPr>
                             <w:r>
@@ -99,7 +98,6 @@
                                 <w:rStyle w:val="color-marker"/>
                                 <w:b/>
                                 <w:bCs/>
-                                <w:highlight w:val="yellow"/>
                               </w:rPr>
                               <w:t>{ORG_NAME}</w:t>
                             </w:r>
@@ -113,52 +111,11 @@
                               <w:rPr>
                                 <w:rStyle w:val="color-marker"/>
                                 <w:rFonts w:ascii="Arial" w:hAnsi="Arial" w:cs="Arial"/>
-                                <w:b/>
-                                <w:bCs/>
-                                <w:highlight w:val="yellow"/>
                               </w:rPr>
                             </w:pPr>
                             <w:r>
-                              <w:rPr>
-                                <w:highlight w:val="yellow"/>
-                              </w:rPr>
-                            </w:r>
-                          </w:p>
-                          <w:p>
-                            <w:pPr>
-                              <w:pStyle w:val="Normal"/>
-                              <w:rPr>
-                                <w:szCs w:val="20"/>
-                                <w:highlight w:val="yellow"/>
-                              </w:rPr>
-                            </w:pPr>
-                            <w:r>
-                              <w:rPr>
-                                <w:szCs w:val="20"/>
-                                <w:highlight w:val="yellow"/>
-                              </w:rPr>
-                              <w:t>___________________</w:t>
-                            </w:r>
-                          </w:p>
-                          <w:p>
-                            <w:pPr>
-                              <w:pStyle w:val="Normal"/>
-                              <w:numPr>
-                                <w:ilvl w:val="0"/>
-                                <w:numId w:val="0"/>
-                              </w:numPr>
-                              <w:shd w:fill="FFFFFF" w:val="clear"/>
-                              <w:spacing w:lineRule="atLeast" w:line="240"/>
-                              <w:outlineLvl w:val="0"/>
-                              <w:rPr>
-                                <w:szCs w:val="20"/>
-                              </w:rPr>
-                            </w:pPr>
-                            <w:r>
-                              <w:rPr>
-                                <w:szCs w:val="20"/>
-                              </w:rPr>
-                              <w:t>_________________</w:t>
+                              <w:rPr/>
+                              <w:t>ИНН {ORG_INN}</w:t>
                             </w:r>
                           </w:p>
                         </w:txbxContent>
@@ -221,7 +178,6 @@
                           <w:rStyle w:val="color-marker"/>
                           <w:b/>
                           <w:bCs/>
-                          <w:highlight w:val="yellow"/>
                         </w:rPr>
                       </w:pPr>
                       <w:r>
@@ -229,7 +185,6 @@
                           <w:rStyle w:val="color-marker"/>
                           <w:b/>
                           <w:bCs/>
-                          <w:highlight w:val="yellow"/>
                         </w:rPr>
                         <w:t>{ORG_NAME}</w:t>
                       </w:r>
@@ -243,52 +198,11 @@
                         <w:rPr>
                           <w:rStyle w:val="color-marker"/>
                           <w:rFonts w:ascii="Arial" w:hAnsi="Arial" w:cs="Arial"/>
-                          <w:b/>
-                          <w:bCs/>
-                          <w:highlight w:val="yellow"/>
                         </w:rPr>
                       </w:pPr>
                       <w:r>
-                        <w:rPr>
-                          <w:highlight w:val="yellow"/>
-                        </w:rPr>
-                      </w:r>
-                    </w:p>
-                    <w:p>
-                      <w:pPr>
-                        <w:pStyle w:val="Normal"/>
-                        <w:rPr>
-                          <w:szCs w:val="20"/>
-                          <w:highlight w:val="yellow"/>
-                        </w:rPr>
-                      </w:pPr>
-                      <w:r>
-                        <w:rPr>
-                          <w:szCs w:val="20"/>
-                          <w:highlight w:val="yellow"/>
-                        </w:rPr>
-                        <w:t>___________________</w:t>
-                      </w:r>
-                    </w:p>
-                    <w:p>
-                      <w:pPr>
-                        <w:pStyle w:val="Normal"/>
-                        <w:numPr>
-                          <w:ilvl w:val="0"/>
-                          <w:numId w:val="0"/>
-                        </w:numPr>
-                        <w:shd w:fill="FFFFFF" w:val="clear"/>
-                        <w:spacing w:lineRule="atLeast" w:line="240"/>
-                        <w:outlineLvl w:val="0"/>
-                        <w:rPr>
-                          <w:szCs w:val="20"/>
-                        </w:rPr>
-                      </w:pPr>
-                      <w:r>
-                        <w:rPr>
-                          <w:szCs w:val="20"/>
-                        </w:rPr>
-                        <w:t>_________________</w:t>
+                        <w:rPr/>
+                        <w:t>ИНН {ORG_INN}</w:t>
                       </w:r>
                     </w:p>
                   </w:txbxContent>

</xml_diff>